<commit_message>
Doc updated: LCP03 - finalized
</commit_message>
<xml_diff>
--- a/6. Documentation With Templates/LCP03/LCP03-AIRBAG-ECU-001_HARA_v110.docx
+++ b/6. Documentation With Templates/LCP03/LCP03-AIRBAG-ECU-001_HARA_v110.docx
@@ -4,7 +4,7 @@
   <w:body>
     <w:tbl>
       <w:tblPr>
-        <w:tblW w:w="10304" w:type="dxa"/>
+        <w:tblW w:w="10101" w:type="dxa"/>
         <w:tblBorders>
           <w:top w:val="single" w:sz="4" w:space="0" w:color="auto"/>
           <w:left w:val="single" w:sz="4" w:space="0" w:color="auto"/>
@@ -20,15 +20,15 @@
         <w:tblLook w:val="04A0" w:firstRow="1" w:lastRow="0" w:firstColumn="1" w:lastColumn="0" w:noHBand="0" w:noVBand="1"/>
       </w:tblPr>
       <w:tblGrid>
-        <w:gridCol w:w="10304"/>
+        <w:gridCol w:w="10101"/>
       </w:tblGrid>
       <w:tr>
         <w:trPr>
-          <w:trHeight w:val="1833"/>
+          <w:trHeight w:val="2371"/>
         </w:trPr>
         <w:tc>
           <w:tcPr>
-            <w:tcW w:w="10304" w:type="dxa"/>
+            <w:tcW w:w="10101" w:type="dxa"/>
             <w:tcBorders>
               <w:top w:val="single" w:sz="4" w:space="0" w:color="1F3864"/>
               <w:left w:val="single" w:sz="4" w:space="0" w:color="1F3864"/>
@@ -44,6 +44,9 @@
             </w:tcMar>
           </w:tcPr>
           <w:p>
+            <w:pPr>
+              <w:jc w:val="center"/>
+            </w:pPr>
             <w:r>
               <w:rPr>
                 <w:color w:val="FFFFFF"/>
@@ -52,26 +55,6 @@
               </w:rPr>
               <w:t>Airbag ECU Portfolio</w:t>
             </w:r>
-            <w:r>
-              <w:rPr>
-                <w:sz w:val="24"/>
-                <w:szCs w:val="24"/>
-              </w:rPr>
-              <w:tab/>
-            </w:r>
-            <w:r>
-              <w:rPr>
-                <w:color w:val="FFFFFF"/>
-                <w:sz w:val="24"/>
-                <w:szCs w:val="24"/>
-              </w:rPr>
-              <w:t>HS Harz — Functional Safety</w:t>
-            </w:r>
-          </w:p>
-          <w:p>
-            <w:pPr>
-              <w:spacing w:before="60" w:after="60"/>
-            </w:pPr>
           </w:p>
           <w:p>
             <w:pPr>
@@ -79,6 +62,18 @@
             </w:pPr>
             <w:r>
               <w:rPr>
+                <w:color w:val="BDD7EE"/>
+              </w:rPr>
+              <w:t>HS Harz — Functional Safety</w:t>
+            </w:r>
+          </w:p>
+          <w:p/>
+          <w:p>
+            <w:pPr>
+              <w:jc w:val="center"/>
+            </w:pPr>
+            <w:r>
+              <w:rPr>
                 <w:b/>
                 <w:bCs/>
                 <w:color w:val="FFFFFF"/>
@@ -88,11 +83,7 @@
               <w:t>AIRBAG ELECTRONIC CONTROL UNIT</w:t>
             </w:r>
           </w:p>
-          <w:p>
-            <w:pPr>
-              <w:spacing w:before="60" w:after="60"/>
-            </w:pPr>
-          </w:p>
+          <w:p/>
           <w:p>
             <w:pPr>
               <w:jc w:val="center"/>
@@ -110,18 +101,18 @@
       </w:tr>
       <w:tr>
         <w:trPr>
-          <w:trHeight w:val="745"/>
+          <w:trHeight w:val="741"/>
         </w:trPr>
         <w:tc>
           <w:tcPr>
-            <w:tcW w:w="10304" w:type="dxa"/>
+            <w:tcW w:w="10101" w:type="dxa"/>
             <w:tcBorders>
               <w:top w:val="single" w:sz="4" w:space="0" w:color="2E75B6"/>
               <w:left w:val="single" w:sz="4" w:space="0" w:color="2E75B6"/>
               <w:bottom w:val="single" w:sz="4" w:space="0" w:color="2E75B6"/>
               <w:right w:val="single" w:sz="4" w:space="0" w:color="2E75B6"/>
             </w:tcBorders>
-            <w:shd w:val="clear" w:color="auto" w:fill="1F3864"/>
+            <w:shd w:val="clear" w:color="auto" w:fill="2E75B6"/>
             <w:tcMar>
               <w:top w:w="200" w:type="dxa"/>
               <w:left w:w="400" w:type="dxa"/>
@@ -132,8 +123,6 @@
           <w:p>
             <w:pPr>
               <w:jc w:val="center"/>
-            </w:pPr>
-            <w:r>
               <w:rPr>
                 <w:b/>
                 <w:bCs/>
@@ -141,8 +130,7 @@
                 <w:sz w:val="32"/>
                 <w:szCs w:val="32"/>
               </w:rPr>
-              <w:t xml:space="preserve">LIFE CYCLE PHASE </w:t>
-            </w:r>
+            </w:pPr>
             <w:r>
               <w:rPr>
                 <w:b/>
@@ -151,7 +139,7 @@
                 <w:sz w:val="32"/>
                 <w:szCs w:val="32"/>
               </w:rPr>
-              <w:t>3</w:t>
+              <w:t xml:space="preserve">LIFE CYCLE PHASE </w:t>
             </w:r>
             <w:r>
               <w:rPr>
@@ -161,7 +149,32 @@
                 <w:sz w:val="32"/>
                 <w:szCs w:val="32"/>
               </w:rPr>
-              <w:t xml:space="preserve"> — HAZARD AND RISK ANALYSIS (HARA)</w:t>
+              <w:t>3</w:t>
+            </w:r>
+            <w:r>
+              <w:rPr>
+                <w:b/>
+                <w:bCs/>
+                <w:color w:val="FFFFFF"/>
+                <w:sz w:val="32"/>
+                <w:szCs w:val="32"/>
+              </w:rPr>
+              <w:t xml:space="preserve"> </w:t>
+            </w:r>
+          </w:p>
+          <w:p>
+            <w:pPr>
+              <w:jc w:val="center"/>
+            </w:pPr>
+            <w:r>
+              <w:rPr>
+                <w:b/>
+                <w:bCs/>
+                <w:color w:val="FFFFFF"/>
+                <w:sz w:val="32"/>
+                <w:szCs w:val="32"/>
+              </w:rPr>
+              <w:t>HAZARD AND RISK ANALYSIS (HARA)</w:t>
             </w:r>
           </w:p>
         </w:tc>
@@ -552,23 +565,21 @@
                 <w:sz w:val="18"/>
                 <w:szCs w:val="18"/>
               </w:rPr>
-              <w:t xml:space="preserve"> HS Harz </w:t>
-            </w:r>
-            <w:proofErr w:type="spellStart"/>
+              <w:t xml:space="preserve"> </w:t>
+            </w:r>
             <w:r>
               <w:rPr>
                 <w:sz w:val="18"/>
                 <w:szCs w:val="18"/>
               </w:rPr>
-              <w:t>FuSa</w:t>
-            </w:r>
-            <w:proofErr w:type="spellEnd"/>
+              <w:t>-</w:t>
+            </w:r>
             <w:r>
               <w:rPr>
                 <w:sz w:val="18"/>
                 <w:szCs w:val="18"/>
               </w:rPr>
-              <w:t xml:space="preserve"> — Systems Safety Engineering Team</w:t>
+              <w:t xml:space="preserve"> Systems Safety Engineering Team</w:t>
             </w:r>
           </w:p>
         </w:tc>
@@ -740,6 +751,7 @@
         <w:br w:type="page"/>
       </w:r>
     </w:p>
+    <w:p/>
     <w:p>
       <w:pPr>
         <w:pBdr>
@@ -755,7 +767,6 @@
           <w:sz w:val="32"/>
           <w:szCs w:val="32"/>
         </w:rPr>
-        <w:lastRenderedPageBreak/>
         <w:t>Table of Contents</w:t>
       </w:r>
     </w:p>
@@ -3001,6 +3012,7 @@
         </w:p>
         <w:p>
           <w:r>
+            <w:lastRenderedPageBreak/>
             <w:fldChar w:fldCharType="end"/>
           </w:r>
         </w:p>

</xml_diff>